<commit_message>
docs: boites surveillees et duree de conservation 3 ans
Co-Authored-By: Claude Sonnet 5.5 <noreply@anthropic.com>
Claude-Session: https://claude.ai/code/session_01PvXkDktcTk16EimHMhsVhK
</commit_message>
<xml_diff>
--- a/docs/MANUEL-SECRETARIAT.docx
+++ b/docs/MANUEL-SECRETARIAT.docx
@@ -3069,16 +3069,553 @@
         <w:spacing w:after="120"/>
       </w:pPr>
       <w:r>
-        <w:t xml:space="preserve">Boîtes surveillées : </w:t>
+        <w:t xml:space="preserve">Les cinq boîtes surveillées :</w:t>
+      </w:r>
+    </w:p>
+    <w:tbl>
+      <w:tblPr>
+        <w:tblW w:type="dxa" w:w="9638"/>
+        <w:tblBorders>
+          <w:top w:val="single" w:color="auto" w:sz="4"/>
+          <w:left w:val="single" w:color="auto" w:sz="4"/>
+          <w:bottom w:val="single" w:color="auto" w:sz="4"/>
+          <w:right w:val="single" w:color="auto" w:sz="4"/>
+          <w:insideH w:val="single" w:color="auto" w:sz="4"/>
+          <w:insideV w:val="single" w:color="auto" w:sz="4"/>
+        </w:tblBorders>
+      </w:tblPr>
+      <w:tblGrid>
+        <w:gridCol w:w="3212"/>
+        <w:gridCol w:w="3212"/>
+        <w:gridCol w:w="3214"/>
+      </w:tblGrid>
+      <w:tr>
+        <w:trPr>
+          <w:tblHeader/>
+        </w:trPr>
+        <w:tc>
+          <w:tcPr>
+            <w:tcW w:type="dxa" w:w="3212"/>
+            <w:tcBorders>
+              <w:top w:val="single" w:color="999999" w:sz="4"/>
+              <w:left w:val="single" w:color="999999" w:sz="4"/>
+              <w:bottom w:val="single" w:color="999999" w:sz="4"/>
+              <w:right w:val="single" w:color="999999" w:sz="4"/>
+            </w:tcBorders>
+            <w:shd w:fill="1F3A5F" w:color="auto" w:val="clear"/>
+            <w:tcMar>
+              <w:top w:type="dxa" w:w="60"/>
+              <w:left w:type="dxa" w:w="100"/>
+              <w:bottom w:type="dxa" w:w="60"/>
+              <w:right w:type="dxa" w:w="100"/>
+            </w:tcMar>
+          </w:tcPr>
+          <w:p>
+            <w:r>
+              <w:rPr>
+                <w:b/>
+                <w:bCs/>
+                <w:color w:val="FFFFFF"/>
+                <w:sz w:val="18"/>
+                <w:szCs w:val="18"/>
+              </w:rPr>
+              <w:t xml:space="preserve">Boîte</w:t>
+            </w:r>
+          </w:p>
+        </w:tc>
+        <w:tc>
+          <w:tcPr>
+            <w:tcW w:type="dxa" w:w="3212"/>
+            <w:tcBorders>
+              <w:top w:val="single" w:color="999999" w:sz="4"/>
+              <w:left w:val="single" w:color="999999" w:sz="4"/>
+              <w:bottom w:val="single" w:color="999999" w:sz="4"/>
+              <w:right w:val="single" w:color="999999" w:sz="4"/>
+            </w:tcBorders>
+            <w:shd w:fill="1F3A5F" w:color="auto" w:val="clear"/>
+            <w:tcMar>
+              <w:top w:type="dxa" w:w="60"/>
+              <w:left w:type="dxa" w:w="100"/>
+              <w:bottom w:type="dxa" w:w="60"/>
+              <w:right w:type="dxa" w:w="100"/>
+            </w:tcMar>
+          </w:tcPr>
+          <w:p>
+            <w:r>
+              <w:rPr>
+                <w:b/>
+                <w:bCs/>
+                <w:color w:val="FFFFFF"/>
+                <w:sz w:val="18"/>
+                <w:szCs w:val="18"/>
+              </w:rPr>
+              <w:t xml:space="preserve">Titulaire</w:t>
+            </w:r>
+          </w:p>
+        </w:tc>
+        <w:tc>
+          <w:tcPr>
+            <w:tcW w:type="dxa" w:w="3214"/>
+            <w:tcBorders>
+              <w:top w:val="single" w:color="999999" w:sz="4"/>
+              <w:left w:val="single" w:color="999999" w:sz="4"/>
+              <w:bottom w:val="single" w:color="999999" w:sz="4"/>
+              <w:right w:val="single" w:color="999999" w:sz="4"/>
+            </w:tcBorders>
+            <w:shd w:fill="1F3A5F" w:color="auto" w:val="clear"/>
+            <w:tcMar>
+              <w:top w:type="dxa" w:w="60"/>
+              <w:left w:type="dxa" w:w="100"/>
+              <w:bottom w:type="dxa" w:w="60"/>
+              <w:right w:type="dxa" w:w="100"/>
+            </w:tcMar>
+          </w:tcPr>
+          <w:p>
+            <w:r>
+              <w:rPr>
+                <w:b/>
+                <w:bCs/>
+                <w:color w:val="FFFFFF"/>
+                <w:sz w:val="18"/>
+                <w:szCs w:val="18"/>
+              </w:rPr>
+              <w:t xml:space="preserve">Rôle</w:t>
+            </w:r>
+          </w:p>
+        </w:tc>
+      </w:tr>
+      <w:tr>
+        <w:trPr>
+          <w:tblHeader w:val="false"/>
+        </w:trPr>
+        <w:tc>
+          <w:tcPr>
+            <w:tcW w:type="dxa" w:w="3212"/>
+            <w:tcBorders>
+              <w:top w:val="single" w:color="999999" w:sz="4"/>
+              <w:left w:val="single" w:color="999999" w:sz="4"/>
+              <w:bottom w:val="single" w:color="999999" w:sz="4"/>
+              <w:right w:val="single" w:color="999999" w:sz="4"/>
+            </w:tcBorders>
+            <w:tcMar>
+              <w:top w:type="dxa" w:w="60"/>
+              <w:left w:type="dxa" w:w="100"/>
+              <w:bottom w:type="dxa" w:w="60"/>
+              <w:right w:type="dxa" w:w="100"/>
+            </w:tcMar>
+          </w:tcPr>
+          <w:p>
+            <w:r>
+              <w:rPr>
+                <w:sz w:val="18"/>
+                <w:szCs w:val="18"/>
+              </w:rPr>
+              <w:t xml:space="preserve">contact@foga-tech.com</w:t>
+            </w:r>
+          </w:p>
+        </w:tc>
+        <w:tc>
+          <w:tcPr>
+            <w:tcW w:type="dxa" w:w="3212"/>
+            <w:tcBorders>
+              <w:top w:val="single" w:color="999999" w:sz="4"/>
+              <w:left w:val="single" w:color="999999" w:sz="4"/>
+              <w:bottom w:val="single" w:color="999999" w:sz="4"/>
+              <w:right w:val="single" w:color="999999" w:sz="4"/>
+            </w:tcBorders>
+            <w:tcMar>
+              <w:top w:type="dxa" w:w="60"/>
+              <w:left w:type="dxa" w:w="100"/>
+              <w:bottom w:type="dxa" w:w="60"/>
+              <w:right w:type="dxa" w:w="100"/>
+            </w:tcMar>
+          </w:tcPr>
+          <w:p>
+            <w:r>
+              <w:rPr>
+                <w:sz w:val="18"/>
+                <w:szCs w:val="18"/>
+              </w:rPr>
+              <w:t xml:space="preserve">Secrétariat</w:t>
+            </w:r>
+          </w:p>
+        </w:tc>
+        <w:tc>
+          <w:tcPr>
+            <w:tcW w:type="dxa" w:w="3214"/>
+            <w:tcBorders>
+              <w:top w:val="single" w:color="999999" w:sz="4"/>
+              <w:left w:val="single" w:color="999999" w:sz="4"/>
+              <w:bottom w:val="single" w:color="999999" w:sz="4"/>
+              <w:right w:val="single" w:color="999999" w:sz="4"/>
+            </w:tcBorders>
+            <w:tcMar>
+              <w:top w:type="dxa" w:w="60"/>
+              <w:left w:type="dxa" w:w="100"/>
+              <w:bottom w:type="dxa" w:w="60"/>
+              <w:right w:type="dxa" w:w="100"/>
+            </w:tcMar>
+          </w:tcPr>
+          <w:p>
+            <w:r>
+              <w:rPr>
+                <w:sz w:val="18"/>
+                <w:szCs w:val="18"/>
+              </w:rPr>
+              <w:t xml:space="preserve">Boîte de l'entreprise, surveillée chaque jour par le secrétariat</w:t>
+            </w:r>
+          </w:p>
+        </w:tc>
+      </w:tr>
+      <w:tr>
+        <w:trPr>
+          <w:tblHeader w:val="false"/>
+        </w:trPr>
+        <w:tc>
+          <w:tcPr>
+            <w:tcW w:type="dxa" w:w="3212"/>
+            <w:tcBorders>
+              <w:top w:val="single" w:color="999999" w:sz="4"/>
+              <w:left w:val="single" w:color="999999" w:sz="4"/>
+              <w:bottom w:val="single" w:color="999999" w:sz="4"/>
+              <w:right w:val="single" w:color="999999" w:sz="4"/>
+            </w:tcBorders>
+            <w:tcMar>
+              <w:top w:type="dxa" w:w="60"/>
+              <w:left w:type="dxa" w:w="100"/>
+              <w:bottom w:type="dxa" w:w="60"/>
+              <w:right w:type="dxa" w:w="100"/>
+            </w:tcMar>
+          </w:tcPr>
+          <w:p>
+            <w:r>
+              <w:rPr>
+                <w:sz w:val="18"/>
+                <w:szCs w:val="18"/>
+              </w:rPr>
+              <w:t xml:space="preserve">cyril.nsaha@foga-tech.com</w:t>
+            </w:r>
+          </w:p>
+        </w:tc>
+        <w:tc>
+          <w:tcPr>
+            <w:tcW w:type="dxa" w:w="3212"/>
+            <w:tcBorders>
+              <w:top w:val="single" w:color="999999" w:sz="4"/>
+              <w:left w:val="single" w:color="999999" w:sz="4"/>
+              <w:bottom w:val="single" w:color="999999" w:sz="4"/>
+              <w:right w:val="single" w:color="999999" w:sz="4"/>
+            </w:tcBorders>
+            <w:tcMar>
+              <w:top w:type="dxa" w:w="60"/>
+              <w:left w:type="dxa" w:w="100"/>
+              <w:bottom w:type="dxa" w:w="60"/>
+              <w:right w:type="dxa" w:w="100"/>
+            </w:tcMar>
+          </w:tcPr>
+          <w:p>
+            <w:r>
+              <w:rPr>
+                <w:sz w:val="18"/>
+                <w:szCs w:val="18"/>
+              </w:rPr>
+              <w:t xml:space="preserve">Directeur général</w:t>
+            </w:r>
+          </w:p>
+        </w:tc>
+        <w:tc>
+          <w:tcPr>
+            <w:tcW w:type="dxa" w:w="3214"/>
+            <w:tcBorders>
+              <w:top w:val="single" w:color="999999" w:sz="4"/>
+              <w:left w:val="single" w:color="999999" w:sz="4"/>
+              <w:bottom w:val="single" w:color="999999" w:sz="4"/>
+              <w:right w:val="single" w:color="999999" w:sz="4"/>
+            </w:tcBorders>
+            <w:tcMar>
+              <w:top w:type="dxa" w:w="60"/>
+              <w:left w:type="dxa" w:w="100"/>
+              <w:bottom w:type="dxa" w:w="60"/>
+              <w:right w:type="dxa" w:w="100"/>
+            </w:tcMar>
+          </w:tcPr>
+          <w:p>
+            <w:r>
+              <w:rPr>
+                <w:sz w:val="18"/>
+                <w:szCs w:val="18"/>
+              </w:rPr>
+              <w:t xml:space="preserve">Boîte professionnelle</w:t>
+            </w:r>
+          </w:p>
+        </w:tc>
+      </w:tr>
+      <w:tr>
+        <w:trPr>
+          <w:tblHeader w:val="false"/>
+        </w:trPr>
+        <w:tc>
+          <w:tcPr>
+            <w:tcW w:type="dxa" w:w="3212"/>
+            <w:tcBorders>
+              <w:top w:val="single" w:color="999999" w:sz="4"/>
+              <w:left w:val="single" w:color="999999" w:sz="4"/>
+              <w:bottom w:val="single" w:color="999999" w:sz="4"/>
+              <w:right w:val="single" w:color="999999" w:sz="4"/>
+            </w:tcBorders>
+            <w:tcMar>
+              <w:top w:type="dxa" w:w="60"/>
+              <w:left w:type="dxa" w:w="100"/>
+              <w:bottom w:type="dxa" w:w="60"/>
+              <w:right w:type="dxa" w:w="100"/>
+            </w:tcMar>
+          </w:tcPr>
+          <w:p>
+            <w:r>
+              <w:rPr>
+                <w:sz w:val="18"/>
+                <w:szCs w:val="18"/>
+              </w:rPr>
+              <w:t xml:space="preserve">prince.ngoulou@foga-tech.com</w:t>
+            </w:r>
+          </w:p>
+        </w:tc>
+        <w:tc>
+          <w:tcPr>
+            <w:tcW w:type="dxa" w:w="3212"/>
+            <w:tcBorders>
+              <w:top w:val="single" w:color="999999" w:sz="4"/>
+              <w:left w:val="single" w:color="999999" w:sz="4"/>
+              <w:bottom w:val="single" w:color="999999" w:sz="4"/>
+              <w:right w:val="single" w:color="999999" w:sz="4"/>
+            </w:tcBorders>
+            <w:tcMar>
+              <w:top w:type="dxa" w:w="60"/>
+              <w:left w:type="dxa" w:w="100"/>
+              <w:bottom w:type="dxa" w:w="60"/>
+              <w:right w:type="dxa" w:w="100"/>
+            </w:tcMar>
+          </w:tcPr>
+          <w:p>
+            <w:r>
+              <w:rPr>
+                <w:sz w:val="18"/>
+                <w:szCs w:val="18"/>
+              </w:rPr>
+              <w:t xml:space="preserve">Directeur général adjoint</w:t>
+            </w:r>
+          </w:p>
+        </w:tc>
+        <w:tc>
+          <w:tcPr>
+            <w:tcW w:type="dxa" w:w="3214"/>
+            <w:tcBorders>
+              <w:top w:val="single" w:color="999999" w:sz="4"/>
+              <w:left w:val="single" w:color="999999" w:sz="4"/>
+              <w:bottom w:val="single" w:color="999999" w:sz="4"/>
+              <w:right w:val="single" w:color="999999" w:sz="4"/>
+            </w:tcBorders>
+            <w:tcMar>
+              <w:top w:type="dxa" w:w="60"/>
+              <w:left w:type="dxa" w:w="100"/>
+              <w:bottom w:type="dxa" w:w="60"/>
+              <w:right w:type="dxa" w:w="100"/>
+            </w:tcMar>
+          </w:tcPr>
+          <w:p>
+            <w:r>
+              <w:rPr>
+                <w:sz w:val="18"/>
+                <w:szCs w:val="18"/>
+              </w:rPr>
+              <w:t xml:space="preserve">Boîte professionnelle</w:t>
+            </w:r>
+          </w:p>
+        </w:tc>
+      </w:tr>
+      <w:tr>
+        <w:trPr>
+          <w:tblHeader w:val="false"/>
+        </w:trPr>
+        <w:tc>
+          <w:tcPr>
+            <w:tcW w:type="dxa" w:w="3212"/>
+            <w:tcBorders>
+              <w:top w:val="single" w:color="999999" w:sz="4"/>
+              <w:left w:val="single" w:color="999999" w:sz="4"/>
+              <w:bottom w:val="single" w:color="999999" w:sz="4"/>
+              <w:right w:val="single" w:color="999999" w:sz="4"/>
+            </w:tcBorders>
+            <w:tcMar>
+              <w:top w:type="dxa" w:w="60"/>
+              <w:left w:type="dxa" w:w="100"/>
+              <w:bottom w:type="dxa" w:w="60"/>
+              <w:right w:type="dxa" w:w="100"/>
+            </w:tcMar>
+          </w:tcPr>
+          <w:p>
+            <w:r>
+              <w:rPr>
+                <w:sz w:val="18"/>
+                <w:szCs w:val="18"/>
+              </w:rPr>
+              <w:t xml:space="preserve">fogat.technology@gmail.com</w:t>
+            </w:r>
+          </w:p>
+        </w:tc>
+        <w:tc>
+          <w:tcPr>
+            <w:tcW w:type="dxa" w:w="3212"/>
+            <w:tcBorders>
+              <w:top w:val="single" w:color="999999" w:sz="4"/>
+              <w:left w:val="single" w:color="999999" w:sz="4"/>
+              <w:bottom w:val="single" w:color="999999" w:sz="4"/>
+              <w:right w:val="single" w:color="999999" w:sz="4"/>
+            </w:tcBorders>
+            <w:tcMar>
+              <w:top w:type="dxa" w:w="60"/>
+              <w:left w:type="dxa" w:w="100"/>
+              <w:bottom w:type="dxa" w:w="60"/>
+              <w:right w:type="dxa" w:w="100"/>
+            </w:tcMar>
+          </w:tcPr>
+          <w:p>
+            <w:r>
+              <w:rPr>
+                <w:sz w:val="18"/>
+                <w:szCs w:val="18"/>
+              </w:rPr>
+              <w:t xml:space="preserve">Directeur général</w:t>
+            </w:r>
+          </w:p>
+        </w:tc>
+        <w:tc>
+          <w:tcPr>
+            <w:tcW w:type="dxa" w:w="3214"/>
+            <w:tcBorders>
+              <w:top w:val="single" w:color="999999" w:sz="4"/>
+              <w:left w:val="single" w:color="999999" w:sz="4"/>
+              <w:bottom w:val="single" w:color="999999" w:sz="4"/>
+              <w:right w:val="single" w:color="999999" w:sz="4"/>
+            </w:tcBorders>
+            <w:tcMar>
+              <w:top w:type="dxa" w:w="60"/>
+              <w:left w:type="dxa" w:w="100"/>
+              <w:bottom w:type="dxa" w:w="60"/>
+              <w:right w:type="dxa" w:w="100"/>
+            </w:tcMar>
+          </w:tcPr>
+          <w:p>
+            <w:r>
+              <w:rPr>
+                <w:sz w:val="18"/>
+                <w:szCs w:val="18"/>
+              </w:rPr>
+              <w:t xml:space="preserve">Boîte Gmail</w:t>
+            </w:r>
+          </w:p>
+        </w:tc>
+      </w:tr>
+      <w:tr>
+        <w:trPr>
+          <w:tblHeader w:val="false"/>
+        </w:trPr>
+        <w:tc>
+          <w:tcPr>
+            <w:tcW w:type="dxa" w:w="3212"/>
+            <w:tcBorders>
+              <w:top w:val="single" w:color="999999" w:sz="4"/>
+              <w:left w:val="single" w:color="999999" w:sz="4"/>
+              <w:bottom w:val="single" w:color="999999" w:sz="4"/>
+              <w:right w:val="single" w:color="999999" w:sz="4"/>
+            </w:tcBorders>
+            <w:tcMar>
+              <w:top w:type="dxa" w:w="60"/>
+              <w:left w:type="dxa" w:w="100"/>
+              <w:bottom w:type="dxa" w:w="60"/>
+              <w:right w:type="dxa" w:w="100"/>
+            </w:tcMar>
+          </w:tcPr>
+          <w:p>
+            <w:r>
+              <w:rPr>
+                <w:sz w:val="18"/>
+                <w:szCs w:val="18"/>
+              </w:rPr>
+              <w:t xml:space="preserve">ngoulounoe5@gmail.com</w:t>
+            </w:r>
+          </w:p>
+        </w:tc>
+        <w:tc>
+          <w:tcPr>
+            <w:tcW w:type="dxa" w:w="3212"/>
+            <w:tcBorders>
+              <w:top w:val="single" w:color="999999" w:sz="4"/>
+              <w:left w:val="single" w:color="999999" w:sz="4"/>
+              <w:bottom w:val="single" w:color="999999" w:sz="4"/>
+              <w:right w:val="single" w:color="999999" w:sz="4"/>
+            </w:tcBorders>
+            <w:tcMar>
+              <w:top w:type="dxa" w:w="60"/>
+              <w:left w:type="dxa" w:w="100"/>
+              <w:bottom w:type="dxa" w:w="60"/>
+              <w:right w:type="dxa" w:w="100"/>
+            </w:tcMar>
+          </w:tcPr>
+          <w:p>
+            <w:r>
+              <w:rPr>
+                <w:sz w:val="18"/>
+                <w:szCs w:val="18"/>
+              </w:rPr>
+              <w:t xml:space="preserve">Directeur général adjoint</w:t>
+            </w:r>
+          </w:p>
+        </w:tc>
+        <w:tc>
+          <w:tcPr>
+            <w:tcW w:type="dxa" w:w="3214"/>
+            <w:tcBorders>
+              <w:top w:val="single" w:color="999999" w:sz="4"/>
+              <w:left w:val="single" w:color="999999" w:sz="4"/>
+              <w:bottom w:val="single" w:color="999999" w:sz="4"/>
+              <w:right w:val="single" w:color="999999" w:sz="4"/>
+            </w:tcBorders>
+            <w:tcMar>
+              <w:top w:type="dxa" w:w="60"/>
+              <w:left w:type="dxa" w:w="100"/>
+              <w:bottom w:type="dxa" w:w="60"/>
+              <w:right w:type="dxa" w:w="100"/>
+            </w:tcMar>
+          </w:tcPr>
+          <w:p>
+            <w:r>
+              <w:rPr>
+                <w:sz w:val="18"/>
+                <w:szCs w:val="18"/>
+              </w:rPr>
+              <w:t xml:space="preserve">Boîte Gmail</w:t>
+            </w:r>
+          </w:p>
+        </w:tc>
+      </w:tr>
+    </w:tbl>
+    <w:p/>
+    <w:p>
+      <w:pPr>
+        <w:spacing w:after="120"/>
+      </w:pPr>
+      <w:r>
+        <w:t xml:space="preserve">Les dirigeants gardent la maîtrise de leur boîte ; le secrétariat n'y accède que pour ce qui est convenu par écrit. Les mails d'intérêt reçus sur les boîtes Gmail des dirigeants sont transférés ou signalés au secrétariat pour enregistrement, afin que le registre soit unique. Les dirigeants n'utilisent plus d'adresse personnelle pour les échanges avec les clients : tout passe par une adresse </w:t>
       </w:r>
       <w:r>
         <w:rPr>
           <w:rFonts w:ascii="Consolas" w:cs="Consolas" w:eastAsia="Consolas" w:hAnsi="Consolas"/>
         </w:rPr>
-        <w:t xml:space="preserve">contact@foga-tech.com</w:t>
-      </w:r>
-      <w:r>
-        <w:t xml:space="preserve"> et les boîtes des dirigeants, selon la liste à jour tenue par la Direction. Les dirigeants gardent la maîtrise de leur boîte ; le secrétariat n'y accède que pour ce qui est convenu par écrit.</w:t>
+        <w:t xml:space="preserve">@foga-tech.com</w:t>
+      </w:r>
+      <w:r>
+        <w:t xml:space="preserve">.</w:t>
       </w:r>
     </w:p>
     <w:p>
@@ -4967,7 +5504,75 @@
         <w:spacing w:after="120"/>
       </w:pPr>
       <w:r>
-        <w:t xml:space="preserve">Les durées à appliquer sont à valider avec la comptabilité et un conseil juridique pour le Congo. En attendant : ne rien détruire, archiver l'ensemble.</w:t>
+        <w:t xml:space="preserve">La durée légale de conservation retenue est de </w:t>
+      </w:r>
+      <w:r>
+        <w:rPr>
+          <w:b/>
+          <w:bCs/>
+        </w:rPr>
+        <w:t xml:space="preserve">3 ans</w:t>
+      </w:r>
+      <w:r>
+        <w:t xml:space="preserve">. Elle s'applique aux courriers et mails du registre, papier et numérique. Règles d'application :</w:t>
+      </w:r>
+    </w:p>
+    <w:p>
+      <w:pPr>
+        <w:pStyle w:val="ListParagraph"/>
+        <w:numPr>
+          <w:ilvl w:val="0"/>
+          <w:numId w:val="2"/>
+        </w:numPr>
+      </w:pPr>
+      <w:r>
+        <w:t xml:space="preserve">Le point de départ est la date de clôture du dossier ; à défaut, la date du document. À confirmer par la Direction.</w:t>
+      </w:r>
+    </w:p>
+    <w:p>
+      <w:pPr>
+        <w:pStyle w:val="ListParagraph"/>
+        <w:numPr>
+          <w:ilvl w:val="0"/>
+          <w:numId w:val="2"/>
+        </w:numPr>
+      </w:pPr>
+      <w:r>
+        <w:t xml:space="preserve">Les dossiers de chantier, contrats, PV de réception et garanties peuvent exiger une conservation plus longue pendant la durée de la garantie décennale mentionnée dans vos procédures : ne pas les détruire sans accord écrit de la Direction.</w:t>
+      </w:r>
+    </w:p>
+    <w:p>
+      <w:pPr>
+        <w:pStyle w:val="ListParagraph"/>
+        <w:numPr>
+          <w:ilvl w:val="0"/>
+          <w:numId w:val="2"/>
+        </w:numPr>
+      </w:pPr>
+      <w:r>
+        <w:t xml:space="preserve">Aucune destruction sans </w:t>
+      </w:r>
+      <w:r>
+        <w:rPr>
+          <w:b/>
+          <w:bCs/>
+        </w:rPr>
+        <w:t xml:space="preserve">procès-verbal de destruction</w:t>
+      </w:r>
+      <w:r>
+        <w:t xml:space="preserve"> signé par la Direction (liste des numéros détruits, date, mode de destruction).</w:t>
+      </w:r>
+    </w:p>
+    <w:p>
+      <w:pPr>
+        <w:pStyle w:val="ListParagraph"/>
+        <w:numPr>
+          <w:ilvl w:val="0"/>
+          <w:numId w:val="2"/>
+        </w:numPr>
+      </w:pPr>
+      <w:r>
+        <w:t xml:space="preserve">Dans le registre, les lignes ne sont jamais supprimées, même après destruction des pièces.</w:t>
       </w:r>
     </w:p>
     <w:p>

</xml_diff>